<commit_message>
Wizard: offer to load boundaries GeoJSON whenever it's missing
- a missing boundaries file is now a first-class gap: every gap
  interview (after zip imports too) detects it and offers to load the
  GeoJSON on the spot, then rolls into the variety interview
- boundaries loading factored into a shared Invoke-BoundariesLoad
  (Flow 2 and the gap check use the same pick/preview/copy/dedupe/sync)
- user guide: naming tables cover block-code labelling; option 1 now
  documents the one-sitting flow (zip + boundaries + varieties)

Verified with scripted runs: decline path warns and continues; accept
path loads via the stdin fallback, re-syncs (blocks 0 -> 10), and the
variety prompts fire immediately after.

Co-Authored-By: Claude Opus 4.8 <noreply@anthropic.com>
</commit_message>
<xml_diff>
--- a/docs/NDVI_Maps_User_Guide.docx
+++ b/docs/NDVI_Maps_User_Guide.docx
@@ -487,15 +487,23 @@
                 <w:sz w:val="20"/>
                 <w:szCs w:val="20"/>
               </w:rPr>
-              <w:t xml:space="preserve">NDVI - Blocks 2 1 12 11 10 3zone_Rx.shp</w:t>
-            </w:r>
-          </w:p>
-          <w:p>
-            <w:pPr>
-              <w:spacing w:after="40"/>
-            </w:pPr>
-            <w:r>
-              <w:t xml:space="preserve">Every Boundary needs a matching Rx with the same name.</w:t>
+              <w:t xml:space="preserve">NDVI - CHRBK04 3 zones_Rx.shp</w:t>
+            </w:r>
+            <w:r>
+              <w:rPr>
+                <w:color w:val="555555"/>
+                <w:sz w:val="20"/>
+                <w:szCs w:val="20"/>
+              </w:rPr>
+              <w:t xml:space="preserve">  (a vineyard's own block codes)</w:t>
+            </w:r>
+          </w:p>
+          <w:p>
+            <w:pPr>
+              <w:spacing w:after="40"/>
+            </w:pPr>
+            <w:r>
+              <w:t xml:space="preserve">Any name works as long as every Boundary has a matching Rx with the same name — the wizard shows you the mapping before converting.</w:t>
             </w:r>
           </w:p>
         </w:tc>
@@ -815,7 +823,7 @@
               <w:spacing w:after="40"/>
             </w:pPr>
             <w:r>
-              <w:t xml:space="preserve">Name every boundary exactly like this in the drawing tool:</w:t>
+              <w:t xml:space="preserve">Name each boundary in the drawing tool in either style — the variety comes from this name:</w:t>
             </w:r>
           </w:p>
           <w:p>
@@ -841,15 +849,23 @@
                 <w:sz w:val="20"/>
                 <w:szCs w:val="20"/>
               </w:rPr>
-              <w:t xml:space="preserve">Block 5b Malbec - 0.082 ha</w:t>
-            </w:r>
-          </w:p>
-          <w:p>
-            <w:pPr>
-              <w:spacing w:after="40"/>
-            </w:pPr>
-            <w:r>
-              <w:t xml:space="preserve">That is: the word Block, the block number (letters like 5b are fine), the variety, then a dash and the area. The tool usually adds the area itself.</w:t>
+              <w:t xml:space="preserve">CHRBK04 - Chardonnay - 1.884 ha</w:t>
+            </w:r>
+            <w:r>
+              <w:rPr>
+                <w:color w:val="555555"/>
+                <w:sz w:val="20"/>
+                <w:szCs w:val="20"/>
+              </w:rPr>
+              <w:t xml:space="preserve">  (a vineyard's own block codes)</w:t>
+            </w:r>
+          </w:p>
+          <w:p>
+            <w:pPr>
+              <w:spacing w:after="40"/>
+            </w:pPr>
+            <w:r>
+              <w:t xml:space="preserve">That is: the block name or code, the variety, then a dash and the area (the tool usually adds the area itself). Blocks named any other way still appear on the map under their exact name — they just won't show a variety until you add it via the wizard.</w:t>
             </w:r>
           </w:p>
         </w:tc>
@@ -1173,7 +1189,7 @@
               <w:spacing w:after="40"/>
             </w:pPr>
             <w:r>
-              <w:t xml:space="preserve">You have a new NDVI zip from Pix4D. Picks the zip, shows you the block mapping before touching anything, converts, checks for gaps, offers to publish.</w:t>
+              <w:t xml:space="preserve">You have a new NDVI zip from Pix4D. Picks the zip, shows you the block mapping before touching anything, converts, checks for gaps, offers to publish. If the vineyard has no boundaries file yet, it offers to load that too — one sitting does the lot.</w:t>
             </w:r>
           </w:p>
         </w:tc>

</xml_diff>